<commit_message>
Completed first version of Game
</commit_message>
<xml_diff>
--- a/docs/Frontend_Packages.docx
+++ b/docs/Frontend_Packages.docx
@@ -116,8 +116,17 @@
                 <w:b/>
                 <w:bCs/>
               </w:rPr>
-              <w:t>react-router-dom</w:t>
-            </w:r>
+              <w:t>react-router-</w:t>
+            </w:r>
+            <w:proofErr w:type="spellStart"/>
+            <w:r>
+              <w:rPr>
+                <w:b/>
+                <w:bCs/>
+              </w:rPr>
+              <w:t>dom</w:t>
+            </w:r>
+            <w:proofErr w:type="spellEnd"/>
           </w:p>
         </w:tc>
         <w:tc>
@@ -156,6 +165,7 @@
             <w:hideMark/>
           </w:tcPr>
           <w:p>
+            <w:proofErr w:type="spellStart"/>
             <w:r>
               <w:rPr>
                 <w:b/>
@@ -163,6 +173,7 @@
               </w:rPr>
               <w:t>axios</w:t>
             </w:r>
+            <w:proofErr w:type="spellEnd"/>
           </w:p>
         </w:tc>
         <w:tc>
@@ -185,7 +196,15 @@
           </w:tcPr>
           <w:p>
             <w:r>
-              <w:t>Create room, Join room, Get game data, etc.</w:t>
+              <w:t xml:space="preserve">Create room, </w:t>
+            </w:r>
+            <w:proofErr w:type="gramStart"/>
+            <w:r>
+              <w:t>Join</w:t>
+            </w:r>
+            <w:proofErr w:type="gramEnd"/>
+            <w:r>
+              <w:t xml:space="preserve"> room, Get game data, etc.</w:t>
             </w:r>
           </w:p>
         </w:tc>
@@ -246,12 +265,21 @@
             <w:hideMark/>
           </w:tcPr>
           <w:p>
+            <w:proofErr w:type="spellStart"/>
             <w:r>
               <w:rPr>
                 <w:b/>
                 <w:bCs/>
               </w:rPr>
-              <w:t>lucide-react</w:t>
+              <w:t>lucide</w:t>
+            </w:r>
+            <w:proofErr w:type="spellEnd"/>
+            <w:r>
+              <w:rPr>
+                <w:b/>
+                <w:bCs/>
+              </w:rPr>
+              <w:t>-react</w:t>
             </w:r>
           </w:p>
         </w:tc>
@@ -291,6 +319,7 @@
             <w:hideMark/>
           </w:tcPr>
           <w:p>
+            <w:proofErr w:type="spellStart"/>
             <w:r>
               <w:rPr>
                 <w:b/>
@@ -298,6 +327,7 @@
               </w:rPr>
               <w:t>zustand</w:t>
             </w:r>
+            <w:proofErr w:type="spellEnd"/>
           </w:p>
         </w:tc>
         <w:tc>
@@ -381,6 +411,7 @@
             <w:hideMark/>
           </w:tcPr>
           <w:p>
+            <w:proofErr w:type="spellStart"/>
             <w:r>
               <w:rPr>
                 <w:b/>
@@ -388,6 +419,7 @@
               </w:rPr>
               <w:t>clsx</w:t>
             </w:r>
+            <w:proofErr w:type="spellEnd"/>
           </w:p>
         </w:tc>
         <w:tc>
@@ -410,7 +442,15 @@
           </w:tcPr>
           <w:p>
             <w:r>
-              <w:t>Change button colors, keyboard key states, player status, etc.</w:t>
+              <w:t xml:space="preserve">Change button </w:t>
+            </w:r>
+            <w:proofErr w:type="spellStart"/>
+            <w:r>
+              <w:t>colors</w:t>
+            </w:r>
+            <w:proofErr w:type="spellEnd"/>
+            <w:r>
+              <w:t>, keyboard key states, player status, etc.</w:t>
             </w:r>
           </w:p>
         </w:tc>
@@ -620,8 +660,21 @@
       </w:r>
     </w:p>
     <w:p>
-      <w:r>
-        <w:t>axios.post("/api/create-room")</w:t>
+      <w:proofErr w:type="spellStart"/>
+      <w:r>
+        <w:t>axios.post</w:t>
+      </w:r>
+      <w:proofErr w:type="spellEnd"/>
+      <w:r>
+        <w:t>("/</w:t>
+      </w:r>
+      <w:proofErr w:type="spellStart"/>
+      <w:r>
+        <w:t>api</w:t>
+      </w:r>
+      <w:proofErr w:type="spellEnd"/>
+      <w:r>
+        <w:t>/create-room")</w:t>
       </w:r>
     </w:p>
     <w:p>
@@ -768,7 +821,23 @@
           <w:b/>
           <w:bCs/>
         </w:rPr>
-        <w:t>4. Lucide React</w:t>
+        <w:t xml:space="preserve">4. </w:t>
+      </w:r>
+      <w:proofErr w:type="spellStart"/>
+      <w:r>
+        <w:rPr>
+          <w:b/>
+          <w:bCs/>
+        </w:rPr>
+        <w:t>Lucide</w:t>
+      </w:r>
+      <w:proofErr w:type="spellEnd"/>
+      <w:r>
+        <w:rPr>
+          <w:b/>
+          <w:bCs/>
+        </w:rPr>
+        <w:t xml:space="preserve"> React</w:t>
       </w:r>
     </w:p>
     <w:p>
@@ -859,18 +928,27 @@
           <w:b/>
           <w:bCs/>
         </w:rPr>
-        <w:t>5. Zustand</w:t>
-      </w:r>
-    </w:p>
-    <w:p>
-      <w:r>
-        <w:t xml:space="preserve">Think of it as a </w:t>
-      </w:r>
+        <w:t xml:space="preserve">5. </w:t>
+      </w:r>
+      <w:proofErr w:type="spellStart"/>
       <w:r>
         <w:rPr>
           <w:b/>
           <w:bCs/>
         </w:rPr>
+        <w:t>Zustand</w:t>
+      </w:r>
+      <w:proofErr w:type="spellEnd"/>
+    </w:p>
+    <w:p>
+      <w:r>
+        <w:t xml:space="preserve">Think of it as a </w:t>
+      </w:r>
+      <w:r>
+        <w:rPr>
+          <w:b/>
+          <w:bCs/>
+        </w:rPr>
         <w:t>shared memory</w:t>
       </w:r>
       <w:r>
@@ -879,7 +957,15 @@
     </w:p>
     <w:p>
       <w:r>
-        <w:t>Without Zustand:</w:t>
+        <w:t xml:space="preserve">Without </w:t>
+      </w:r>
+      <w:proofErr w:type="spellStart"/>
+      <w:r>
+        <w:t>Zustand</w:t>
+      </w:r>
+      <w:proofErr w:type="spellEnd"/>
+      <w:r>
+        <w:t>:</w:t>
       </w:r>
     </w:p>
     <w:p>
@@ -938,7 +1024,15 @@
     </w:p>
     <w:p>
       <w:r>
-        <w:t>With Zustand:</w:t>
+        <w:t xml:space="preserve">With </w:t>
+      </w:r>
+      <w:proofErr w:type="spellStart"/>
+      <w:r>
+        <w:t>Zustand</w:t>
+      </w:r>
+      <w:proofErr w:type="spellEnd"/>
+      <w:r>
+        <w:t>:</w:t>
       </w:r>
     </w:p>
     <w:p>
@@ -1058,8 +1152,13 @@
       </w:r>
     </w:p>
     <w:p>
-      <w:r>
-        <w:t>alert("Room Created")</w:t>
+      <w:proofErr w:type="gramStart"/>
+      <w:r>
+        <w:t>alert(</w:t>
+      </w:r>
+      <w:proofErr w:type="gramEnd"/>
+      <w:r>
+        <w:t>"Room Created")</w:t>
       </w:r>
     </w:p>
     <w:p>
@@ -1133,8 +1232,17 @@
           <w:b/>
           <w:bCs/>
         </w:rPr>
-        <w:t>7. clsx</w:t>
-      </w:r>
+        <w:t xml:space="preserve">7. </w:t>
+      </w:r>
+      <w:proofErr w:type="spellStart"/>
+      <w:r>
+        <w:rPr>
+          <w:b/>
+          <w:bCs/>
+        </w:rPr>
+        <w:t>clsx</w:t>
+      </w:r>
+      <w:proofErr w:type="spellEnd"/>
     </w:p>
     <w:p>
       <w:r>
@@ -1143,12 +1251,25 @@
     </w:p>
     <w:p>
       <w:r>
-        <w:t>if(correct){</w:t>
-      </w:r>
-    </w:p>
-    <w:p>
-      <w:r>
-        <w:t xml:space="preserve">    className="green"</w:t>
+        <w:t>if(correct</w:t>
+      </w:r>
+      <w:proofErr w:type="gramStart"/>
+      <w:r>
+        <w:t>){</w:t>
+      </w:r>
+      <w:proofErr w:type="gramEnd"/>
+    </w:p>
+    <w:p>
+      <w:r>
+        <w:t xml:space="preserve">    </w:t>
+      </w:r>
+      <w:proofErr w:type="spellStart"/>
+      <w:r>
+        <w:t>className</w:t>
+      </w:r>
+      <w:proofErr w:type="spellEnd"/>
+      <w:r>
+        <w:t>="green"</w:t>
       </w:r>
     </w:p>
     <w:p>
@@ -1157,13 +1278,23 @@
       </w:r>
     </w:p>
     <w:p>
+      <w:proofErr w:type="gramStart"/>
       <w:r>
         <w:t>else{</w:t>
       </w:r>
-    </w:p>
-    <w:p>
-      <w:r>
-        <w:t xml:space="preserve">    className="red"</w:t>
+      <w:proofErr w:type="gramEnd"/>
+    </w:p>
+    <w:p>
+      <w:r>
+        <w:t xml:space="preserve">    </w:t>
+      </w:r>
+      <w:proofErr w:type="spellStart"/>
+      <w:r>
+        <w:t>className</w:t>
+      </w:r>
+      <w:proofErr w:type="spellEnd"/>
+      <w:r>
+        <w:t>="red"</w:t>
       </w:r>
     </w:p>
     <w:p>
@@ -1177,9 +1308,16 @@
       </w:r>
     </w:p>
     <w:p>
-      <w:r>
-        <w:t>clsx(</w:t>
-      </w:r>
+      <w:proofErr w:type="spellStart"/>
+      <w:proofErr w:type="gramStart"/>
+      <w:r>
+        <w:t>clsx</w:t>
+      </w:r>
+      <w:proofErr w:type="spellEnd"/>
+      <w:r>
+        <w:t>(</w:t>
+      </w:r>
+      <w:proofErr w:type="gramEnd"/>
     </w:p>
     <w:p>
       <w:r>
@@ -1316,6 +1454,7 @@
             <w:hideMark/>
           </w:tcPr>
           <w:p>
+            <w:proofErr w:type="spellStart"/>
             <w:r>
               <w:rPr>
                 <w:b/>
@@ -1323,6 +1462,7 @@
               </w:rPr>
               <w:t>tailwindcss</w:t>
             </w:r>
+            <w:proofErr w:type="spellEnd"/>
           </w:p>
         </w:tc>
         <w:tc>
@@ -1382,24 +1522,41 @@
             <w:hideMark/>
           </w:tcPr>
           <w:p>
+            <w:proofErr w:type="spellStart"/>
             <w:r>
               <w:rPr>
                 <w:b/>
                 <w:bCs/>
               </w:rPr>
-              <w:t>eslint-config-prettier</w:t>
-            </w:r>
-          </w:p>
-        </w:tc>
-        <w:tc>
-          <w:tcPr>
-            <w:tcW w:w="0" w:type="auto"/>
-            <w:vAlign w:val="center"/>
-            <w:hideMark/>
-          </w:tcPr>
-          <w:p>
-            <w:r>
-              <w:t>Makes ESLint and Prettier work together</w:t>
+              <w:t>eslint</w:t>
+            </w:r>
+            <w:proofErr w:type="spellEnd"/>
+            <w:r>
+              <w:rPr>
+                <w:b/>
+                <w:bCs/>
+              </w:rPr>
+              <w:t>-config-prettier</w:t>
+            </w:r>
+          </w:p>
+        </w:tc>
+        <w:tc>
+          <w:tcPr>
+            <w:tcW w:w="0" w:type="auto"/>
+            <w:vAlign w:val="center"/>
+            <w:hideMark/>
+          </w:tcPr>
+          <w:p>
+            <w:r>
+              <w:t xml:space="preserve">Makes </w:t>
+            </w:r>
+            <w:proofErr w:type="spellStart"/>
+            <w:r>
+              <w:t>ESLint</w:t>
+            </w:r>
+            <w:proofErr w:type="spellEnd"/>
+            <w:r>
+              <w:t xml:space="preserve"> and Prettier work together</w:t>
             </w:r>
           </w:p>
         </w:tc>
@@ -1415,12 +1572,37 @@
             <w:hideMark/>
           </w:tcPr>
           <w:p>
+            <w:proofErr w:type="spellStart"/>
             <w:r>
               <w:rPr>
                 <w:b/>
                 <w:bCs/>
               </w:rPr>
-              <w:t>django-cors-headers</w:t>
+              <w:t>django</w:t>
+            </w:r>
+            <w:proofErr w:type="spellEnd"/>
+            <w:r>
+              <w:rPr>
+                <w:b/>
+                <w:bCs/>
+              </w:rPr>
+              <w:t>-</w:t>
+            </w:r>
+            <w:proofErr w:type="spellStart"/>
+            <w:r>
+              <w:rPr>
+                <w:b/>
+                <w:bCs/>
+              </w:rPr>
+              <w:t>cors</w:t>
+            </w:r>
+            <w:proofErr w:type="spellEnd"/>
+            <w:r>
+              <w:rPr>
+                <w:b/>
+                <w:bCs/>
+              </w:rPr>
+              <w:t>-headers</w:t>
             </w:r>
           </w:p>
         </w:tc>
@@ -1448,25 +1630,39 @@
             <w:hideMark/>
           </w:tcPr>
           <w:p>
+            <w:proofErr w:type="spellStart"/>
             <w:r>
               <w:rPr>
                 <w:b/>
                 <w:bCs/>
               </w:rPr>
-              <w:t>django-channels</w:t>
-            </w:r>
-          </w:p>
-        </w:tc>
-        <w:tc>
-          <w:tcPr>
-            <w:tcW w:w="0" w:type="auto"/>
-            <w:vAlign w:val="center"/>
-            <w:hideMark/>
-          </w:tcPr>
-          <w:p>
-            <w:r>
-              <w:t>Enables WebSockets</w:t>
-            </w:r>
+              <w:t>django</w:t>
+            </w:r>
+            <w:proofErr w:type="spellEnd"/>
+            <w:r>
+              <w:rPr>
+                <w:b/>
+                <w:bCs/>
+              </w:rPr>
+              <w:t>-channels</w:t>
+            </w:r>
+          </w:p>
+        </w:tc>
+        <w:tc>
+          <w:tcPr>
+            <w:tcW w:w="0" w:type="auto"/>
+            <w:vAlign w:val="center"/>
+            <w:hideMark/>
+          </w:tcPr>
+          <w:p>
+            <w:r>
+              <w:t xml:space="preserve">Enables </w:t>
+            </w:r>
+            <w:proofErr w:type="spellStart"/>
+            <w:r>
+              <w:t>WebSockets</w:t>
+            </w:r>
+            <w:proofErr w:type="spellEnd"/>
           </w:p>
         </w:tc>
       </w:tr>
@@ -1486,8 +1682,17 @@
                 <w:b/>
                 <w:bCs/>
               </w:rPr>
-              <w:t>channels-redis</w:t>
-            </w:r>
+              <w:t>channels-</w:t>
+            </w:r>
+            <w:proofErr w:type="spellStart"/>
+            <w:r>
+              <w:rPr>
+                <w:b/>
+                <w:bCs/>
+              </w:rPr>
+              <w:t>redis</w:t>
+            </w:r>
+            <w:proofErr w:type="spellEnd"/>
           </w:p>
         </w:tc>
         <w:tc>
@@ -1514,6 +1719,7 @@
             <w:hideMark/>
           </w:tcPr>
           <w:p>
+            <w:proofErr w:type="spellStart"/>
             <w:r>
               <w:rPr>
                 <w:b/>
@@ -1521,6 +1727,7 @@
               </w:rPr>
               <w:t>psycopg</w:t>
             </w:r>
+            <w:proofErr w:type="spellEnd"/>
           </w:p>
         </w:tc>
         <w:tc>
@@ -1583,7 +1790,16 @@
         <w:t>──</w:t>
       </w:r>
       <w:r>
-        <w:t xml:space="preserve"> react-router-dom  </w:t>
+        <w:t xml:space="preserve"> react-router-</w:t>
+      </w:r>
+      <w:proofErr w:type="spellStart"/>
+      <w:proofErr w:type="gramStart"/>
+      <w:r>
+        <w:t>dom</w:t>
+      </w:r>
+      <w:proofErr w:type="spellEnd"/>
+      <w:r>
+        <w:t xml:space="preserve">  </w:t>
       </w:r>
       <w:r>
         <w:rPr>
@@ -1591,6 +1807,7 @@
         </w:rPr>
         <w:t>→</w:t>
       </w:r>
+      <w:proofErr w:type="gramEnd"/>
       <w:r>
         <w:t xml:space="preserve"> Navigation</w:t>
       </w:r>
@@ -1609,7 +1826,15 @@
         <w:t>──</w:t>
       </w:r>
       <w:r>
-        <w:t xml:space="preserve"> axios             </w:t>
+        <w:t xml:space="preserve"> </w:t>
+      </w:r>
+      <w:proofErr w:type="spellStart"/>
+      <w:r>
+        <w:t>axios</w:t>
+      </w:r>
+      <w:proofErr w:type="spellEnd"/>
+      <w:r>
+        <w:t xml:space="preserve">             </w:t>
       </w:r>
       <w:r>
         <w:rPr>
@@ -1661,7 +1886,15 @@
         <w:t>──</w:t>
       </w:r>
       <w:r>
-        <w:t xml:space="preserve"> lucide-react      </w:t>
+        <w:t xml:space="preserve"> </w:t>
+      </w:r>
+      <w:proofErr w:type="spellStart"/>
+      <w:r>
+        <w:t>lucide</w:t>
+      </w:r>
+      <w:proofErr w:type="spellEnd"/>
+      <w:r>
+        <w:t xml:space="preserve">-react      </w:t>
       </w:r>
       <w:r>
         <w:rPr>
@@ -1687,7 +1920,15 @@
         <w:t>──</w:t>
       </w:r>
       <w:r>
-        <w:t xml:space="preserve"> zustand           </w:t>
+        <w:t xml:space="preserve"> </w:t>
+      </w:r>
+      <w:proofErr w:type="spellStart"/>
+      <w:r>
+        <w:t>zustand</w:t>
+      </w:r>
+      <w:proofErr w:type="spellEnd"/>
+      <w:r>
+        <w:t xml:space="preserve">           </w:t>
       </w:r>
       <w:r>
         <w:rPr>
@@ -1718,12 +1959,28 @@
     </w:p>
     <w:p>
       <w:r>
-        <w:t>└── clsx              → Cleaner conditional styling</w:t>
-      </w:r>
-    </w:p>
-    <w:p>
-      <w:r>
-        <w:t>These packages form the foundation of our frontend. Once they're installed, we won't need to think about infrastructure again—we can focus on building the actual HangSync application.</w:t>
+        <w:t xml:space="preserve">└── </w:t>
+      </w:r>
+      <w:proofErr w:type="spellStart"/>
+      <w:r>
+        <w:t>clsx</w:t>
+      </w:r>
+      <w:proofErr w:type="spellEnd"/>
+      <w:r>
+        <w:t xml:space="preserve">              → Cleaner conditional styling</w:t>
+      </w:r>
+    </w:p>
+    <w:p>
+      <w:r>
+        <w:t xml:space="preserve">These packages form the foundation of our frontend. Once they're installed, we won't need to think about infrastructure again—we can focus on building the actual </w:t>
+      </w:r>
+      <w:proofErr w:type="spellStart"/>
+      <w:r>
+        <w:t>HangSync</w:t>
+      </w:r>
+      <w:proofErr w:type="spellEnd"/>
+      <w:r>
+        <w:t xml:space="preserve"> application.</w:t>
       </w:r>
     </w:p>
     <w:p/>
@@ -1906,9 +2163,19 @@
             <w:hideMark/>
           </w:tcPr>
           <w:p>
-            <w:r>
-              <w:t>shadcn/ui</w:t>
-            </w:r>
+            <w:proofErr w:type="spellStart"/>
+            <w:r>
+              <w:t>shadcn</w:t>
+            </w:r>
+            <w:proofErr w:type="spellEnd"/>
+            <w:r>
+              <w:t>/</w:t>
+            </w:r>
+            <w:proofErr w:type="spellStart"/>
+            <w:r>
+              <w:t>ui</w:t>
+            </w:r>
+            <w:proofErr w:type="spellEnd"/>
           </w:p>
         </w:tc>
       </w:tr>
@@ -1964,8 +2231,13 @@
             <w:hideMark/>
           </w:tcPr>
           <w:p>
-            <w:r>
-              <w:t>Lucide React</w:t>
+            <w:proofErr w:type="spellStart"/>
+            <w:r>
+              <w:t>Lucide</w:t>
+            </w:r>
+            <w:proofErr w:type="spellEnd"/>
+            <w:r>
+              <w:t xml:space="preserve"> React</w:t>
             </w:r>
           </w:p>
         </w:tc>
@@ -2051,9 +2323,11 @@
             <w:hideMark/>
           </w:tcPr>
           <w:p>
+            <w:proofErr w:type="spellStart"/>
             <w:r>
               <w:t>Zustand</w:t>
             </w:r>
+            <w:proofErr w:type="spellEnd"/>
           </w:p>
         </w:tc>
       </w:tr>
@@ -2088,6 +2362,392 @@
       </w:tr>
     </w:tbl>
     <w:p/>
+    <w:p/>
+    <w:p>
+      <w:pPr>
+        <w:rPr>
+          <w:b/>
+          <w:bCs/>
+        </w:rPr>
+      </w:pPr>
+      <w:r>
+        <w:rPr>
+          <w:b/>
+          <w:bCs/>
+        </w:rPr>
+        <w:t>Development Plan</w:t>
+      </w:r>
+    </w:p>
+    <w:p>
+      <w:r>
+        <w:t>We'll build the project in this order:</w:t>
+      </w:r>
+    </w:p>
+    <w:p>
+      <w:pPr>
+        <w:rPr>
+          <w:b/>
+          <w:bCs/>
+        </w:rPr>
+      </w:pPr>
+      <w:r>
+        <w:rPr>
+          <w:b/>
+          <w:bCs/>
+        </w:rPr>
+        <w:t xml:space="preserve">Phase 1 </w:t>
+      </w:r>
+      <w:r>
+        <w:rPr>
+          <w:rFonts w:ascii="Segoe UI Emoji" w:hAnsi="Segoe UI Emoji" w:cs="Segoe UI Emoji"/>
+          <w:b/>
+          <w:bCs/>
+        </w:rPr>
+        <w:t>✅</w:t>
+      </w:r>
+    </w:p>
+    <w:p>
+      <w:pPr>
+        <w:numPr>
+          <w:ilvl w:val="0"/>
+          <w:numId w:val="3"/>
+        </w:numPr>
+      </w:pPr>
+      <w:r>
+        <w:t xml:space="preserve">Project Setup </w:t>
+      </w:r>
+    </w:p>
+    <w:p>
+      <w:pPr>
+        <w:rPr>
+          <w:b/>
+          <w:bCs/>
+        </w:rPr>
+      </w:pPr>
+      <w:r>
+        <w:rPr>
+          <w:b/>
+          <w:bCs/>
+        </w:rPr>
+        <w:t xml:space="preserve">Phase 2 </w:t>
+      </w:r>
+      <w:r>
+        <w:rPr>
+          <w:rFonts w:ascii="Segoe UI Emoji" w:hAnsi="Segoe UI Emoji" w:cs="Segoe UI Emoji"/>
+          <w:b/>
+          <w:bCs/>
+        </w:rPr>
+        <w:t>✅</w:t>
+      </w:r>
+    </w:p>
+    <w:p>
+      <w:pPr>
+        <w:numPr>
+          <w:ilvl w:val="0"/>
+          <w:numId w:val="4"/>
+        </w:numPr>
+      </w:pPr>
+      <w:r>
+        <w:t xml:space="preserve">React + Tailwind + </w:t>
+      </w:r>
+      <w:proofErr w:type="spellStart"/>
+      <w:r>
+        <w:t>shadcn</w:t>
+      </w:r>
+      <w:proofErr w:type="spellEnd"/>
+      <w:r>
+        <w:t xml:space="preserve"> </w:t>
+      </w:r>
+    </w:p>
+    <w:p>
+      <w:pPr>
+        <w:rPr>
+          <w:b/>
+          <w:bCs/>
+        </w:rPr>
+      </w:pPr>
+      <w:r>
+        <w:rPr>
+          <w:b/>
+          <w:bCs/>
+        </w:rPr>
+        <w:t>Phase 3 (Current)</w:t>
+      </w:r>
+    </w:p>
+    <w:p>
+      <w:pPr>
+        <w:numPr>
+          <w:ilvl w:val="0"/>
+          <w:numId w:val="5"/>
+        </w:numPr>
+      </w:pPr>
+      <w:r>
+        <w:t xml:space="preserve">Logo </w:t>
+      </w:r>
+    </w:p>
+    <w:p>
+      <w:pPr>
+        <w:numPr>
+          <w:ilvl w:val="0"/>
+          <w:numId w:val="5"/>
+        </w:numPr>
+      </w:pPr>
+      <w:proofErr w:type="spellStart"/>
+      <w:r>
+        <w:t>PageContainer</w:t>
+      </w:r>
+      <w:proofErr w:type="spellEnd"/>
+      <w:r>
+        <w:t xml:space="preserve"> </w:t>
+      </w:r>
+    </w:p>
+    <w:p>
+      <w:pPr>
+        <w:numPr>
+          <w:ilvl w:val="0"/>
+          <w:numId w:val="5"/>
+        </w:numPr>
+      </w:pPr>
+      <w:proofErr w:type="spellStart"/>
+      <w:r>
+        <w:t>GlassCard</w:t>
+      </w:r>
+      <w:proofErr w:type="spellEnd"/>
+      <w:r>
+        <w:t xml:space="preserve"> </w:t>
+      </w:r>
+    </w:p>
+    <w:p>
+      <w:pPr>
+        <w:numPr>
+          <w:ilvl w:val="0"/>
+          <w:numId w:val="5"/>
+        </w:numPr>
+      </w:pPr>
+      <w:proofErr w:type="spellStart"/>
+      <w:r>
+        <w:t>AppButton</w:t>
+      </w:r>
+      <w:proofErr w:type="spellEnd"/>
+      <w:r>
+        <w:t xml:space="preserve"> </w:t>
+      </w:r>
+    </w:p>
+    <w:p>
+      <w:pPr>
+        <w:numPr>
+          <w:ilvl w:val="0"/>
+          <w:numId w:val="5"/>
+        </w:numPr>
+      </w:pPr>
+      <w:proofErr w:type="spellStart"/>
+      <w:r>
+        <w:t>AppInput</w:t>
+      </w:r>
+      <w:proofErr w:type="spellEnd"/>
+      <w:r>
+        <w:t xml:space="preserve"> </w:t>
+      </w:r>
+    </w:p>
+    <w:p>
+      <w:pPr>
+        <w:numPr>
+          <w:ilvl w:val="0"/>
+          <w:numId w:val="5"/>
+        </w:numPr>
+      </w:pPr>
+      <w:proofErr w:type="spellStart"/>
+      <w:r>
+        <w:lastRenderedPageBreak/>
+        <w:t>IconButton</w:t>
+      </w:r>
+      <w:proofErr w:type="spellEnd"/>
+      <w:r>
+        <w:t xml:space="preserve"> </w:t>
+      </w:r>
+    </w:p>
+    <w:p>
+      <w:pPr>
+        <w:rPr>
+          <w:b/>
+          <w:bCs/>
+        </w:rPr>
+      </w:pPr>
+      <w:r>
+        <w:rPr>
+          <w:b/>
+          <w:bCs/>
+        </w:rPr>
+        <w:t>Phase 4</w:t>
+      </w:r>
+    </w:p>
+    <w:p>
+      <w:pPr>
+        <w:numPr>
+          <w:ilvl w:val="0"/>
+          <w:numId w:val="6"/>
+        </w:numPr>
+      </w:pPr>
+      <w:r>
+        <w:t xml:space="preserve">Routing </w:t>
+      </w:r>
+    </w:p>
+    <w:p>
+      <w:pPr>
+        <w:rPr>
+          <w:b/>
+          <w:bCs/>
+        </w:rPr>
+      </w:pPr>
+      <w:r>
+        <w:rPr>
+          <w:b/>
+          <w:bCs/>
+        </w:rPr>
+        <w:t>Phase 5</w:t>
+      </w:r>
+    </w:p>
+    <w:p>
+      <w:pPr>
+        <w:numPr>
+          <w:ilvl w:val="0"/>
+          <w:numId w:val="7"/>
+        </w:numPr>
+      </w:pPr>
+      <w:r>
+        <w:t xml:space="preserve">Home Screen </w:t>
+      </w:r>
+    </w:p>
+    <w:p>
+      <w:pPr>
+        <w:rPr>
+          <w:b/>
+          <w:bCs/>
+        </w:rPr>
+      </w:pPr>
+      <w:r>
+        <w:rPr>
+          <w:b/>
+          <w:bCs/>
+        </w:rPr>
+        <w:t>Phase 6</w:t>
+      </w:r>
+    </w:p>
+    <w:p>
+      <w:pPr>
+        <w:numPr>
+          <w:ilvl w:val="0"/>
+          <w:numId w:val="8"/>
+        </w:numPr>
+      </w:pPr>
+      <w:r>
+        <w:t xml:space="preserve">Join Room </w:t>
+      </w:r>
+    </w:p>
+    <w:p>
+      <w:pPr>
+        <w:rPr>
+          <w:b/>
+          <w:bCs/>
+        </w:rPr>
+      </w:pPr>
+      <w:r>
+        <w:rPr>
+          <w:b/>
+          <w:bCs/>
+        </w:rPr>
+        <w:t>Phase 7</w:t>
+      </w:r>
+    </w:p>
+    <w:p>
+      <w:pPr>
+        <w:numPr>
+          <w:ilvl w:val="0"/>
+          <w:numId w:val="9"/>
+        </w:numPr>
+      </w:pPr>
+      <w:r>
+        <w:t xml:space="preserve">Waiting Room </w:t>
+      </w:r>
+    </w:p>
+    <w:p>
+      <w:pPr>
+        <w:rPr>
+          <w:b/>
+          <w:bCs/>
+        </w:rPr>
+      </w:pPr>
+      <w:r>
+        <w:rPr>
+          <w:b/>
+          <w:bCs/>
+        </w:rPr>
+        <w:t>Phase 8</w:t>
+      </w:r>
+    </w:p>
+    <w:p>
+      <w:pPr>
+        <w:numPr>
+          <w:ilvl w:val="0"/>
+          <w:numId w:val="10"/>
+        </w:numPr>
+      </w:pPr>
+      <w:r>
+        <w:t xml:space="preserve">Game Screen </w:t>
+      </w:r>
+    </w:p>
+    <w:p>
+      <w:pPr>
+        <w:rPr>
+          <w:b/>
+          <w:bCs/>
+        </w:rPr>
+      </w:pPr>
+      <w:r>
+        <w:rPr>
+          <w:b/>
+          <w:bCs/>
+        </w:rPr>
+        <w:t>Phase 9</w:t>
+      </w:r>
+    </w:p>
+    <w:p>
+      <w:pPr>
+        <w:numPr>
+          <w:ilvl w:val="0"/>
+          <w:numId w:val="11"/>
+        </w:numPr>
+      </w:pPr>
+      <w:r>
+        <w:t xml:space="preserve">Backend </w:t>
+      </w:r>
+    </w:p>
+    <w:p>
+      <w:pPr>
+        <w:rPr>
+          <w:b/>
+          <w:bCs/>
+        </w:rPr>
+      </w:pPr>
+      <w:r>
+        <w:rPr>
+          <w:b/>
+          <w:bCs/>
+        </w:rPr>
+        <w:t>Phase 10</w:t>
+      </w:r>
+    </w:p>
+    <w:p>
+      <w:pPr>
+        <w:numPr>
+          <w:ilvl w:val="0"/>
+          <w:numId w:val="12"/>
+        </w:numPr>
+      </w:pPr>
+      <w:r>
+        <w:t>WebSocket</w:t>
+      </w:r>
+    </w:p>
     <w:p/>
     <w:sectPr>
       <w:pgSz w:w="11906" w:h="16838"/>
@@ -2102,6 +2762,155 @@
 <file path=word/numbering.xml><?xml version="1.0" encoding="utf-8"?>
 <w:numbering xmlns:wpc="http://schemas.microsoft.com/office/word/2010/wordprocessingCanvas" xmlns:cx="http://schemas.microsoft.com/office/drawing/2014/chartex" xmlns:cx1="http://schemas.microsoft.com/office/drawing/2015/9/8/chartex" xmlns:cx2="http://schemas.microsoft.com/office/drawing/2015/10/21/chartex" xmlns:cx3="http://schemas.microsoft.com/office/drawing/2016/5/9/chartex" xmlns:cx4="http://schemas.microsoft.com/office/drawing/2016/5/10/chartex" xmlns:cx5="http://schemas.microsoft.com/office/drawing/2016/5/11/chartex" xmlns:cx6="http://schemas.microsoft.com/office/drawing/2016/5/12/chartex" xmlns:cx7="http://schemas.microsoft.com/office/drawing/2016/5/13/chartex" xmlns:cx8="http://schemas.microsoft.com/office/drawing/2016/5/14/chartex" xmlns:mc="http://schemas.openxmlformats.org/markup-compatibility/2006" xmlns:aink="http://schemas.microsoft.com/office/drawing/2016/ink" xmlns:am3d="http://schemas.microsoft.com/office/drawing/2017/model3d" xmlns:o="urn:schemas-microsoft-com:office:office" xmlns:oel="http://schemas.microsoft.com/office/2019/extlst" xmlns:r="http://schemas.openxmlformats.org/officeDocument/2006/relationships" xmlns:m="http://schemas.openxmlformats.org/officeDocument/2006/math" xmlns:v="urn:schemas-microsoft-com:vml" xmlns:wp14="http://schemas.microsoft.com/office/word/2010/wordprocessingDrawing" xmlns:wp="http://schemas.openxmlformats.org/drawingml/2006/wordprocessingDrawing" xmlns:w10="urn:schemas-microsoft-com:office:word" xmlns:w="http://schemas.openxmlformats.org/wordprocessingml/2006/main" xmlns:w14="http://schemas.microsoft.com/office/word/2010/wordml" xmlns:w15="http://schemas.microsoft.com/office/word/2012/wordml" xmlns:w16cex="http://schemas.microsoft.com/office/word/2018/wordml/cex" xmlns:w16cid="http://schemas.microsoft.com/office/word/2016/wordml/cid" xmlns:w16="http://schemas.microsoft.com/office/word/2018/wordml" xmlns:w16du="http://schemas.microsoft.com/office/word/2023/wordml/word16du" xmlns:w16sdtdh="http://schemas.microsoft.com/office/word/2020/wordml/sdtdatahash" xmlns:w16sdtfl="http://schemas.microsoft.com/office/word/2024/wordml/sdtformatlock" xmlns:w16se="http://schemas.microsoft.com/office/word/2015/wordml/symex" xmlns:wpg="http://schemas.microsoft.com/office/word/2010/wordprocessingGroup" xmlns:wpi="http://schemas.microsoft.com/office/word/2010/wordprocessingInk" xmlns:wne="http://schemas.microsoft.com/office/word/2006/wordml" xmlns:wps="http://schemas.microsoft.com/office/word/2010/wordprocessingShape" mc:Ignorable="w14 w15 w16se w16cid w16 w16cex w16sdtdh w16sdtfl w16du wp14">
   <w:abstractNum w:abstractNumId="0" w15:restartNumberingAfterBreak="0">
+    <w:nsid w:val="07546246"/>
+    <w:multiLevelType w:val="multilevel"/>
+    <w:tmpl w:val="E5489666"/>
+    <w:lvl w:ilvl="0">
+      <w:start w:val="1"/>
+      <w:numFmt w:val="bullet"/>
+      <w:lvlText w:val=""/>
+      <w:lvlJc w:val="left"/>
+      <w:pPr>
+        <w:tabs>
+          <w:tab w:val="num" w:pos="720"/>
+        </w:tabs>
+        <w:ind w:left="720" w:hanging="360"/>
+      </w:pPr>
+      <w:rPr>
+        <w:rFonts w:ascii="Symbol" w:hAnsi="Symbol" w:hint="default"/>
+        <w:sz w:val="20"/>
+      </w:rPr>
+    </w:lvl>
+    <w:lvl w:ilvl="1" w:tentative="1">
+      <w:start w:val="1"/>
+      <w:numFmt w:val="bullet"/>
+      <w:lvlText w:val="o"/>
+      <w:lvlJc w:val="left"/>
+      <w:pPr>
+        <w:tabs>
+          <w:tab w:val="num" w:pos="1440"/>
+        </w:tabs>
+        <w:ind w:left="1440" w:hanging="360"/>
+      </w:pPr>
+      <w:rPr>
+        <w:rFonts w:ascii="Courier New" w:hAnsi="Courier New" w:hint="default"/>
+        <w:sz w:val="20"/>
+      </w:rPr>
+    </w:lvl>
+    <w:lvl w:ilvl="2" w:tentative="1">
+      <w:start w:val="1"/>
+      <w:numFmt w:val="bullet"/>
+      <w:lvlText w:val=""/>
+      <w:lvlJc w:val="left"/>
+      <w:pPr>
+        <w:tabs>
+          <w:tab w:val="num" w:pos="2160"/>
+        </w:tabs>
+        <w:ind w:left="2160" w:hanging="360"/>
+      </w:pPr>
+      <w:rPr>
+        <w:rFonts w:ascii="Wingdings" w:hAnsi="Wingdings" w:hint="default"/>
+        <w:sz w:val="20"/>
+      </w:rPr>
+    </w:lvl>
+    <w:lvl w:ilvl="3" w:tentative="1">
+      <w:start w:val="1"/>
+      <w:numFmt w:val="bullet"/>
+      <w:lvlText w:val=""/>
+      <w:lvlJc w:val="left"/>
+      <w:pPr>
+        <w:tabs>
+          <w:tab w:val="num" w:pos="2880"/>
+        </w:tabs>
+        <w:ind w:left="2880" w:hanging="360"/>
+      </w:pPr>
+      <w:rPr>
+        <w:rFonts w:ascii="Wingdings" w:hAnsi="Wingdings" w:hint="default"/>
+        <w:sz w:val="20"/>
+      </w:rPr>
+    </w:lvl>
+    <w:lvl w:ilvl="4" w:tentative="1">
+      <w:start w:val="1"/>
+      <w:numFmt w:val="bullet"/>
+      <w:lvlText w:val=""/>
+      <w:lvlJc w:val="left"/>
+      <w:pPr>
+        <w:tabs>
+          <w:tab w:val="num" w:pos="3600"/>
+        </w:tabs>
+        <w:ind w:left="3600" w:hanging="360"/>
+      </w:pPr>
+      <w:rPr>
+        <w:rFonts w:ascii="Wingdings" w:hAnsi="Wingdings" w:hint="default"/>
+        <w:sz w:val="20"/>
+      </w:rPr>
+    </w:lvl>
+    <w:lvl w:ilvl="5" w:tentative="1">
+      <w:start w:val="1"/>
+      <w:numFmt w:val="bullet"/>
+      <w:lvlText w:val=""/>
+      <w:lvlJc w:val="left"/>
+      <w:pPr>
+        <w:tabs>
+          <w:tab w:val="num" w:pos="4320"/>
+        </w:tabs>
+        <w:ind w:left="4320" w:hanging="360"/>
+      </w:pPr>
+      <w:rPr>
+        <w:rFonts w:ascii="Wingdings" w:hAnsi="Wingdings" w:hint="default"/>
+        <w:sz w:val="20"/>
+      </w:rPr>
+    </w:lvl>
+    <w:lvl w:ilvl="6" w:tentative="1">
+      <w:start w:val="1"/>
+      <w:numFmt w:val="bullet"/>
+      <w:lvlText w:val=""/>
+      <w:lvlJc w:val="left"/>
+      <w:pPr>
+        <w:tabs>
+          <w:tab w:val="num" w:pos="5040"/>
+        </w:tabs>
+        <w:ind w:left="5040" w:hanging="360"/>
+      </w:pPr>
+      <w:rPr>
+        <w:rFonts w:ascii="Wingdings" w:hAnsi="Wingdings" w:hint="default"/>
+        <w:sz w:val="20"/>
+      </w:rPr>
+    </w:lvl>
+    <w:lvl w:ilvl="7" w:tentative="1">
+      <w:start w:val="1"/>
+      <w:numFmt w:val="bullet"/>
+      <w:lvlText w:val=""/>
+      <w:lvlJc w:val="left"/>
+      <w:pPr>
+        <w:tabs>
+          <w:tab w:val="num" w:pos="5760"/>
+        </w:tabs>
+        <w:ind w:left="5760" w:hanging="360"/>
+      </w:pPr>
+      <w:rPr>
+        <w:rFonts w:ascii="Wingdings" w:hAnsi="Wingdings" w:hint="default"/>
+        <w:sz w:val="20"/>
+      </w:rPr>
+    </w:lvl>
+    <w:lvl w:ilvl="8" w:tentative="1">
+      <w:start w:val="1"/>
+      <w:numFmt w:val="bullet"/>
+      <w:lvlText w:val=""/>
+      <w:lvlJc w:val="left"/>
+      <w:pPr>
+        <w:tabs>
+          <w:tab w:val="num" w:pos="6480"/>
+        </w:tabs>
+        <w:ind w:left="6480" w:hanging="360"/>
+      </w:pPr>
+      <w:rPr>
+        <w:rFonts w:ascii="Wingdings" w:hAnsi="Wingdings" w:hint="default"/>
+        <w:sz w:val="20"/>
+      </w:rPr>
+    </w:lvl>
+  </w:abstractNum>
+  <w:abstractNum w:abstractNumId="1" w15:restartNumberingAfterBreak="0">
     <w:nsid w:val="09885923"/>
     <w:multiLevelType w:val="multilevel"/>
     <w:tmpl w:val="AD3A39E0"/>
@@ -2250,7 +3059,454 @@
       </w:rPr>
     </w:lvl>
   </w:abstractNum>
-  <w:abstractNum w:abstractNumId="1" w15:restartNumberingAfterBreak="0">
+  <w:abstractNum w:abstractNumId="2" w15:restartNumberingAfterBreak="0">
+    <w:nsid w:val="1306000F"/>
+    <w:multiLevelType w:val="multilevel"/>
+    <w:tmpl w:val="BADE48EC"/>
+    <w:lvl w:ilvl="0">
+      <w:start w:val="1"/>
+      <w:numFmt w:val="bullet"/>
+      <w:lvlText w:val=""/>
+      <w:lvlJc w:val="left"/>
+      <w:pPr>
+        <w:tabs>
+          <w:tab w:val="num" w:pos="720"/>
+        </w:tabs>
+        <w:ind w:left="720" w:hanging="360"/>
+      </w:pPr>
+      <w:rPr>
+        <w:rFonts w:ascii="Symbol" w:hAnsi="Symbol" w:hint="default"/>
+        <w:sz w:val="20"/>
+      </w:rPr>
+    </w:lvl>
+    <w:lvl w:ilvl="1" w:tentative="1">
+      <w:start w:val="1"/>
+      <w:numFmt w:val="bullet"/>
+      <w:lvlText w:val="o"/>
+      <w:lvlJc w:val="left"/>
+      <w:pPr>
+        <w:tabs>
+          <w:tab w:val="num" w:pos="1440"/>
+        </w:tabs>
+        <w:ind w:left="1440" w:hanging="360"/>
+      </w:pPr>
+      <w:rPr>
+        <w:rFonts w:ascii="Courier New" w:hAnsi="Courier New" w:hint="default"/>
+        <w:sz w:val="20"/>
+      </w:rPr>
+    </w:lvl>
+    <w:lvl w:ilvl="2" w:tentative="1">
+      <w:start w:val="1"/>
+      <w:numFmt w:val="bullet"/>
+      <w:lvlText w:val=""/>
+      <w:lvlJc w:val="left"/>
+      <w:pPr>
+        <w:tabs>
+          <w:tab w:val="num" w:pos="2160"/>
+        </w:tabs>
+        <w:ind w:left="2160" w:hanging="360"/>
+      </w:pPr>
+      <w:rPr>
+        <w:rFonts w:ascii="Wingdings" w:hAnsi="Wingdings" w:hint="default"/>
+        <w:sz w:val="20"/>
+      </w:rPr>
+    </w:lvl>
+    <w:lvl w:ilvl="3" w:tentative="1">
+      <w:start w:val="1"/>
+      <w:numFmt w:val="bullet"/>
+      <w:lvlText w:val=""/>
+      <w:lvlJc w:val="left"/>
+      <w:pPr>
+        <w:tabs>
+          <w:tab w:val="num" w:pos="2880"/>
+        </w:tabs>
+        <w:ind w:left="2880" w:hanging="360"/>
+      </w:pPr>
+      <w:rPr>
+        <w:rFonts w:ascii="Wingdings" w:hAnsi="Wingdings" w:hint="default"/>
+        <w:sz w:val="20"/>
+      </w:rPr>
+    </w:lvl>
+    <w:lvl w:ilvl="4" w:tentative="1">
+      <w:start w:val="1"/>
+      <w:numFmt w:val="bullet"/>
+      <w:lvlText w:val=""/>
+      <w:lvlJc w:val="left"/>
+      <w:pPr>
+        <w:tabs>
+          <w:tab w:val="num" w:pos="3600"/>
+        </w:tabs>
+        <w:ind w:left="3600" w:hanging="360"/>
+      </w:pPr>
+      <w:rPr>
+        <w:rFonts w:ascii="Wingdings" w:hAnsi="Wingdings" w:hint="default"/>
+        <w:sz w:val="20"/>
+      </w:rPr>
+    </w:lvl>
+    <w:lvl w:ilvl="5" w:tentative="1">
+      <w:start w:val="1"/>
+      <w:numFmt w:val="bullet"/>
+      <w:lvlText w:val=""/>
+      <w:lvlJc w:val="left"/>
+      <w:pPr>
+        <w:tabs>
+          <w:tab w:val="num" w:pos="4320"/>
+        </w:tabs>
+        <w:ind w:left="4320" w:hanging="360"/>
+      </w:pPr>
+      <w:rPr>
+        <w:rFonts w:ascii="Wingdings" w:hAnsi="Wingdings" w:hint="default"/>
+        <w:sz w:val="20"/>
+      </w:rPr>
+    </w:lvl>
+    <w:lvl w:ilvl="6" w:tentative="1">
+      <w:start w:val="1"/>
+      <w:numFmt w:val="bullet"/>
+      <w:lvlText w:val=""/>
+      <w:lvlJc w:val="left"/>
+      <w:pPr>
+        <w:tabs>
+          <w:tab w:val="num" w:pos="5040"/>
+        </w:tabs>
+        <w:ind w:left="5040" w:hanging="360"/>
+      </w:pPr>
+      <w:rPr>
+        <w:rFonts w:ascii="Wingdings" w:hAnsi="Wingdings" w:hint="default"/>
+        <w:sz w:val="20"/>
+      </w:rPr>
+    </w:lvl>
+    <w:lvl w:ilvl="7" w:tentative="1">
+      <w:start w:val="1"/>
+      <w:numFmt w:val="bullet"/>
+      <w:lvlText w:val=""/>
+      <w:lvlJc w:val="left"/>
+      <w:pPr>
+        <w:tabs>
+          <w:tab w:val="num" w:pos="5760"/>
+        </w:tabs>
+        <w:ind w:left="5760" w:hanging="360"/>
+      </w:pPr>
+      <w:rPr>
+        <w:rFonts w:ascii="Wingdings" w:hAnsi="Wingdings" w:hint="default"/>
+        <w:sz w:val="20"/>
+      </w:rPr>
+    </w:lvl>
+    <w:lvl w:ilvl="8" w:tentative="1">
+      <w:start w:val="1"/>
+      <w:numFmt w:val="bullet"/>
+      <w:lvlText w:val=""/>
+      <w:lvlJc w:val="left"/>
+      <w:pPr>
+        <w:tabs>
+          <w:tab w:val="num" w:pos="6480"/>
+        </w:tabs>
+        <w:ind w:left="6480" w:hanging="360"/>
+      </w:pPr>
+      <w:rPr>
+        <w:rFonts w:ascii="Wingdings" w:hAnsi="Wingdings" w:hint="default"/>
+        <w:sz w:val="20"/>
+      </w:rPr>
+    </w:lvl>
+  </w:abstractNum>
+  <w:abstractNum w:abstractNumId="3" w15:restartNumberingAfterBreak="0">
+    <w:nsid w:val="2EC74DAC"/>
+    <w:multiLevelType w:val="multilevel"/>
+    <w:tmpl w:val="26B43A96"/>
+    <w:lvl w:ilvl="0">
+      <w:start w:val="1"/>
+      <w:numFmt w:val="bullet"/>
+      <w:lvlText w:val=""/>
+      <w:lvlJc w:val="left"/>
+      <w:pPr>
+        <w:tabs>
+          <w:tab w:val="num" w:pos="720"/>
+        </w:tabs>
+        <w:ind w:left="720" w:hanging="360"/>
+      </w:pPr>
+      <w:rPr>
+        <w:rFonts w:ascii="Symbol" w:hAnsi="Symbol" w:hint="default"/>
+        <w:sz w:val="20"/>
+      </w:rPr>
+    </w:lvl>
+    <w:lvl w:ilvl="1" w:tentative="1">
+      <w:start w:val="1"/>
+      <w:numFmt w:val="bullet"/>
+      <w:lvlText w:val="o"/>
+      <w:lvlJc w:val="left"/>
+      <w:pPr>
+        <w:tabs>
+          <w:tab w:val="num" w:pos="1440"/>
+        </w:tabs>
+        <w:ind w:left="1440" w:hanging="360"/>
+      </w:pPr>
+      <w:rPr>
+        <w:rFonts w:ascii="Courier New" w:hAnsi="Courier New" w:hint="default"/>
+        <w:sz w:val="20"/>
+      </w:rPr>
+    </w:lvl>
+    <w:lvl w:ilvl="2" w:tentative="1">
+      <w:start w:val="1"/>
+      <w:numFmt w:val="bullet"/>
+      <w:lvlText w:val=""/>
+      <w:lvlJc w:val="left"/>
+      <w:pPr>
+        <w:tabs>
+          <w:tab w:val="num" w:pos="2160"/>
+        </w:tabs>
+        <w:ind w:left="2160" w:hanging="360"/>
+      </w:pPr>
+      <w:rPr>
+        <w:rFonts w:ascii="Wingdings" w:hAnsi="Wingdings" w:hint="default"/>
+        <w:sz w:val="20"/>
+      </w:rPr>
+    </w:lvl>
+    <w:lvl w:ilvl="3" w:tentative="1">
+      <w:start w:val="1"/>
+      <w:numFmt w:val="bullet"/>
+      <w:lvlText w:val=""/>
+      <w:lvlJc w:val="left"/>
+      <w:pPr>
+        <w:tabs>
+          <w:tab w:val="num" w:pos="2880"/>
+        </w:tabs>
+        <w:ind w:left="2880" w:hanging="360"/>
+      </w:pPr>
+      <w:rPr>
+        <w:rFonts w:ascii="Wingdings" w:hAnsi="Wingdings" w:hint="default"/>
+        <w:sz w:val="20"/>
+      </w:rPr>
+    </w:lvl>
+    <w:lvl w:ilvl="4" w:tentative="1">
+      <w:start w:val="1"/>
+      <w:numFmt w:val="bullet"/>
+      <w:lvlText w:val=""/>
+      <w:lvlJc w:val="left"/>
+      <w:pPr>
+        <w:tabs>
+          <w:tab w:val="num" w:pos="3600"/>
+        </w:tabs>
+        <w:ind w:left="3600" w:hanging="360"/>
+      </w:pPr>
+      <w:rPr>
+        <w:rFonts w:ascii="Wingdings" w:hAnsi="Wingdings" w:hint="default"/>
+        <w:sz w:val="20"/>
+      </w:rPr>
+    </w:lvl>
+    <w:lvl w:ilvl="5" w:tentative="1">
+      <w:start w:val="1"/>
+      <w:numFmt w:val="bullet"/>
+      <w:lvlText w:val=""/>
+      <w:lvlJc w:val="left"/>
+      <w:pPr>
+        <w:tabs>
+          <w:tab w:val="num" w:pos="4320"/>
+        </w:tabs>
+        <w:ind w:left="4320" w:hanging="360"/>
+      </w:pPr>
+      <w:rPr>
+        <w:rFonts w:ascii="Wingdings" w:hAnsi="Wingdings" w:hint="default"/>
+        <w:sz w:val="20"/>
+      </w:rPr>
+    </w:lvl>
+    <w:lvl w:ilvl="6" w:tentative="1">
+      <w:start w:val="1"/>
+      <w:numFmt w:val="bullet"/>
+      <w:lvlText w:val=""/>
+      <w:lvlJc w:val="left"/>
+      <w:pPr>
+        <w:tabs>
+          <w:tab w:val="num" w:pos="5040"/>
+        </w:tabs>
+        <w:ind w:left="5040" w:hanging="360"/>
+      </w:pPr>
+      <w:rPr>
+        <w:rFonts w:ascii="Wingdings" w:hAnsi="Wingdings" w:hint="default"/>
+        <w:sz w:val="20"/>
+      </w:rPr>
+    </w:lvl>
+    <w:lvl w:ilvl="7" w:tentative="1">
+      <w:start w:val="1"/>
+      <w:numFmt w:val="bullet"/>
+      <w:lvlText w:val=""/>
+      <w:lvlJc w:val="left"/>
+      <w:pPr>
+        <w:tabs>
+          <w:tab w:val="num" w:pos="5760"/>
+        </w:tabs>
+        <w:ind w:left="5760" w:hanging="360"/>
+      </w:pPr>
+      <w:rPr>
+        <w:rFonts w:ascii="Wingdings" w:hAnsi="Wingdings" w:hint="default"/>
+        <w:sz w:val="20"/>
+      </w:rPr>
+    </w:lvl>
+    <w:lvl w:ilvl="8" w:tentative="1">
+      <w:start w:val="1"/>
+      <w:numFmt w:val="bullet"/>
+      <w:lvlText w:val=""/>
+      <w:lvlJc w:val="left"/>
+      <w:pPr>
+        <w:tabs>
+          <w:tab w:val="num" w:pos="6480"/>
+        </w:tabs>
+        <w:ind w:left="6480" w:hanging="360"/>
+      </w:pPr>
+      <w:rPr>
+        <w:rFonts w:ascii="Wingdings" w:hAnsi="Wingdings" w:hint="default"/>
+        <w:sz w:val="20"/>
+      </w:rPr>
+    </w:lvl>
+  </w:abstractNum>
+  <w:abstractNum w:abstractNumId="4" w15:restartNumberingAfterBreak="0">
+    <w:nsid w:val="31A07BBE"/>
+    <w:multiLevelType w:val="multilevel"/>
+    <w:tmpl w:val="DAF20760"/>
+    <w:lvl w:ilvl="0">
+      <w:start w:val="1"/>
+      <w:numFmt w:val="bullet"/>
+      <w:lvlText w:val=""/>
+      <w:lvlJc w:val="left"/>
+      <w:pPr>
+        <w:tabs>
+          <w:tab w:val="num" w:pos="720"/>
+        </w:tabs>
+        <w:ind w:left="720" w:hanging="360"/>
+      </w:pPr>
+      <w:rPr>
+        <w:rFonts w:ascii="Symbol" w:hAnsi="Symbol" w:hint="default"/>
+        <w:sz w:val="20"/>
+      </w:rPr>
+    </w:lvl>
+    <w:lvl w:ilvl="1" w:tentative="1">
+      <w:start w:val="1"/>
+      <w:numFmt w:val="bullet"/>
+      <w:lvlText w:val="o"/>
+      <w:lvlJc w:val="left"/>
+      <w:pPr>
+        <w:tabs>
+          <w:tab w:val="num" w:pos="1440"/>
+        </w:tabs>
+        <w:ind w:left="1440" w:hanging="360"/>
+      </w:pPr>
+      <w:rPr>
+        <w:rFonts w:ascii="Courier New" w:hAnsi="Courier New" w:hint="default"/>
+        <w:sz w:val="20"/>
+      </w:rPr>
+    </w:lvl>
+    <w:lvl w:ilvl="2" w:tentative="1">
+      <w:start w:val="1"/>
+      <w:numFmt w:val="bullet"/>
+      <w:lvlText w:val=""/>
+      <w:lvlJc w:val="left"/>
+      <w:pPr>
+        <w:tabs>
+          <w:tab w:val="num" w:pos="2160"/>
+        </w:tabs>
+        <w:ind w:left="2160" w:hanging="360"/>
+      </w:pPr>
+      <w:rPr>
+        <w:rFonts w:ascii="Wingdings" w:hAnsi="Wingdings" w:hint="default"/>
+        <w:sz w:val="20"/>
+      </w:rPr>
+    </w:lvl>
+    <w:lvl w:ilvl="3" w:tentative="1">
+      <w:start w:val="1"/>
+      <w:numFmt w:val="bullet"/>
+      <w:lvlText w:val=""/>
+      <w:lvlJc w:val="left"/>
+      <w:pPr>
+        <w:tabs>
+          <w:tab w:val="num" w:pos="2880"/>
+        </w:tabs>
+        <w:ind w:left="2880" w:hanging="360"/>
+      </w:pPr>
+      <w:rPr>
+        <w:rFonts w:ascii="Wingdings" w:hAnsi="Wingdings" w:hint="default"/>
+        <w:sz w:val="20"/>
+      </w:rPr>
+    </w:lvl>
+    <w:lvl w:ilvl="4" w:tentative="1">
+      <w:start w:val="1"/>
+      <w:numFmt w:val="bullet"/>
+      <w:lvlText w:val=""/>
+      <w:lvlJc w:val="left"/>
+      <w:pPr>
+        <w:tabs>
+          <w:tab w:val="num" w:pos="3600"/>
+        </w:tabs>
+        <w:ind w:left="3600" w:hanging="360"/>
+      </w:pPr>
+      <w:rPr>
+        <w:rFonts w:ascii="Wingdings" w:hAnsi="Wingdings" w:hint="default"/>
+        <w:sz w:val="20"/>
+      </w:rPr>
+    </w:lvl>
+    <w:lvl w:ilvl="5" w:tentative="1">
+      <w:start w:val="1"/>
+      <w:numFmt w:val="bullet"/>
+      <w:lvlText w:val=""/>
+      <w:lvlJc w:val="left"/>
+      <w:pPr>
+        <w:tabs>
+          <w:tab w:val="num" w:pos="4320"/>
+        </w:tabs>
+        <w:ind w:left="4320" w:hanging="360"/>
+      </w:pPr>
+      <w:rPr>
+        <w:rFonts w:ascii="Wingdings" w:hAnsi="Wingdings" w:hint="default"/>
+        <w:sz w:val="20"/>
+      </w:rPr>
+    </w:lvl>
+    <w:lvl w:ilvl="6" w:tentative="1">
+      <w:start w:val="1"/>
+      <w:numFmt w:val="bullet"/>
+      <w:lvlText w:val=""/>
+      <w:lvlJc w:val="left"/>
+      <w:pPr>
+        <w:tabs>
+          <w:tab w:val="num" w:pos="5040"/>
+        </w:tabs>
+        <w:ind w:left="5040" w:hanging="360"/>
+      </w:pPr>
+      <w:rPr>
+        <w:rFonts w:ascii="Wingdings" w:hAnsi="Wingdings" w:hint="default"/>
+        <w:sz w:val="20"/>
+      </w:rPr>
+    </w:lvl>
+    <w:lvl w:ilvl="7" w:tentative="1">
+      <w:start w:val="1"/>
+      <w:numFmt w:val="bullet"/>
+      <w:lvlText w:val=""/>
+      <w:lvlJc w:val="left"/>
+      <w:pPr>
+        <w:tabs>
+          <w:tab w:val="num" w:pos="5760"/>
+        </w:tabs>
+        <w:ind w:left="5760" w:hanging="360"/>
+      </w:pPr>
+      <w:rPr>
+        <w:rFonts w:ascii="Wingdings" w:hAnsi="Wingdings" w:hint="default"/>
+        <w:sz w:val="20"/>
+      </w:rPr>
+    </w:lvl>
+    <w:lvl w:ilvl="8" w:tentative="1">
+      <w:start w:val="1"/>
+      <w:numFmt w:val="bullet"/>
+      <w:lvlText w:val=""/>
+      <w:lvlJc w:val="left"/>
+      <w:pPr>
+        <w:tabs>
+          <w:tab w:val="num" w:pos="6480"/>
+        </w:tabs>
+        <w:ind w:left="6480" w:hanging="360"/>
+      </w:pPr>
+      <w:rPr>
+        <w:rFonts w:ascii="Wingdings" w:hAnsi="Wingdings" w:hint="default"/>
+        <w:sz w:val="20"/>
+      </w:rPr>
+    </w:lvl>
+  </w:abstractNum>
+  <w:abstractNum w:abstractNumId="5" w15:restartNumberingAfterBreak="0">
     <w:nsid w:val="38AC545B"/>
     <w:multiLevelType w:val="multilevel"/>
     <w:tmpl w:val="EC449310"/>
@@ -2399,11 +3655,935 @@
       </w:rPr>
     </w:lvl>
   </w:abstractNum>
+  <w:abstractNum w:abstractNumId="6" w15:restartNumberingAfterBreak="0">
+    <w:nsid w:val="6CDD2614"/>
+    <w:multiLevelType w:val="multilevel"/>
+    <w:tmpl w:val="03B0BFD6"/>
+    <w:lvl w:ilvl="0">
+      <w:start w:val="1"/>
+      <w:numFmt w:val="bullet"/>
+      <w:lvlText w:val=""/>
+      <w:lvlJc w:val="left"/>
+      <w:pPr>
+        <w:tabs>
+          <w:tab w:val="num" w:pos="720"/>
+        </w:tabs>
+        <w:ind w:left="720" w:hanging="360"/>
+      </w:pPr>
+      <w:rPr>
+        <w:rFonts w:ascii="Symbol" w:hAnsi="Symbol" w:hint="default"/>
+        <w:sz w:val="20"/>
+      </w:rPr>
+    </w:lvl>
+    <w:lvl w:ilvl="1" w:tentative="1">
+      <w:start w:val="1"/>
+      <w:numFmt w:val="bullet"/>
+      <w:lvlText w:val="o"/>
+      <w:lvlJc w:val="left"/>
+      <w:pPr>
+        <w:tabs>
+          <w:tab w:val="num" w:pos="1440"/>
+        </w:tabs>
+        <w:ind w:left="1440" w:hanging="360"/>
+      </w:pPr>
+      <w:rPr>
+        <w:rFonts w:ascii="Courier New" w:hAnsi="Courier New" w:hint="default"/>
+        <w:sz w:val="20"/>
+      </w:rPr>
+    </w:lvl>
+    <w:lvl w:ilvl="2" w:tentative="1">
+      <w:start w:val="1"/>
+      <w:numFmt w:val="bullet"/>
+      <w:lvlText w:val=""/>
+      <w:lvlJc w:val="left"/>
+      <w:pPr>
+        <w:tabs>
+          <w:tab w:val="num" w:pos="2160"/>
+        </w:tabs>
+        <w:ind w:left="2160" w:hanging="360"/>
+      </w:pPr>
+      <w:rPr>
+        <w:rFonts w:ascii="Wingdings" w:hAnsi="Wingdings" w:hint="default"/>
+        <w:sz w:val="20"/>
+      </w:rPr>
+    </w:lvl>
+    <w:lvl w:ilvl="3" w:tentative="1">
+      <w:start w:val="1"/>
+      <w:numFmt w:val="bullet"/>
+      <w:lvlText w:val=""/>
+      <w:lvlJc w:val="left"/>
+      <w:pPr>
+        <w:tabs>
+          <w:tab w:val="num" w:pos="2880"/>
+        </w:tabs>
+        <w:ind w:left="2880" w:hanging="360"/>
+      </w:pPr>
+      <w:rPr>
+        <w:rFonts w:ascii="Wingdings" w:hAnsi="Wingdings" w:hint="default"/>
+        <w:sz w:val="20"/>
+      </w:rPr>
+    </w:lvl>
+    <w:lvl w:ilvl="4" w:tentative="1">
+      <w:start w:val="1"/>
+      <w:numFmt w:val="bullet"/>
+      <w:lvlText w:val=""/>
+      <w:lvlJc w:val="left"/>
+      <w:pPr>
+        <w:tabs>
+          <w:tab w:val="num" w:pos="3600"/>
+        </w:tabs>
+        <w:ind w:left="3600" w:hanging="360"/>
+      </w:pPr>
+      <w:rPr>
+        <w:rFonts w:ascii="Wingdings" w:hAnsi="Wingdings" w:hint="default"/>
+        <w:sz w:val="20"/>
+      </w:rPr>
+    </w:lvl>
+    <w:lvl w:ilvl="5" w:tentative="1">
+      <w:start w:val="1"/>
+      <w:numFmt w:val="bullet"/>
+      <w:lvlText w:val=""/>
+      <w:lvlJc w:val="left"/>
+      <w:pPr>
+        <w:tabs>
+          <w:tab w:val="num" w:pos="4320"/>
+        </w:tabs>
+        <w:ind w:left="4320" w:hanging="360"/>
+      </w:pPr>
+      <w:rPr>
+        <w:rFonts w:ascii="Wingdings" w:hAnsi="Wingdings" w:hint="default"/>
+        <w:sz w:val="20"/>
+      </w:rPr>
+    </w:lvl>
+    <w:lvl w:ilvl="6" w:tentative="1">
+      <w:start w:val="1"/>
+      <w:numFmt w:val="bullet"/>
+      <w:lvlText w:val=""/>
+      <w:lvlJc w:val="left"/>
+      <w:pPr>
+        <w:tabs>
+          <w:tab w:val="num" w:pos="5040"/>
+        </w:tabs>
+        <w:ind w:left="5040" w:hanging="360"/>
+      </w:pPr>
+      <w:rPr>
+        <w:rFonts w:ascii="Wingdings" w:hAnsi="Wingdings" w:hint="default"/>
+        <w:sz w:val="20"/>
+      </w:rPr>
+    </w:lvl>
+    <w:lvl w:ilvl="7" w:tentative="1">
+      <w:start w:val="1"/>
+      <w:numFmt w:val="bullet"/>
+      <w:lvlText w:val=""/>
+      <w:lvlJc w:val="left"/>
+      <w:pPr>
+        <w:tabs>
+          <w:tab w:val="num" w:pos="5760"/>
+        </w:tabs>
+        <w:ind w:left="5760" w:hanging="360"/>
+      </w:pPr>
+      <w:rPr>
+        <w:rFonts w:ascii="Wingdings" w:hAnsi="Wingdings" w:hint="default"/>
+        <w:sz w:val="20"/>
+      </w:rPr>
+    </w:lvl>
+    <w:lvl w:ilvl="8" w:tentative="1">
+      <w:start w:val="1"/>
+      <w:numFmt w:val="bullet"/>
+      <w:lvlText w:val=""/>
+      <w:lvlJc w:val="left"/>
+      <w:pPr>
+        <w:tabs>
+          <w:tab w:val="num" w:pos="6480"/>
+        </w:tabs>
+        <w:ind w:left="6480" w:hanging="360"/>
+      </w:pPr>
+      <w:rPr>
+        <w:rFonts w:ascii="Wingdings" w:hAnsi="Wingdings" w:hint="default"/>
+        <w:sz w:val="20"/>
+      </w:rPr>
+    </w:lvl>
+  </w:abstractNum>
+  <w:abstractNum w:abstractNumId="7" w15:restartNumberingAfterBreak="0">
+    <w:nsid w:val="70287A63"/>
+    <w:multiLevelType w:val="multilevel"/>
+    <w:tmpl w:val="07328228"/>
+    <w:lvl w:ilvl="0">
+      <w:start w:val="1"/>
+      <w:numFmt w:val="bullet"/>
+      <w:lvlText w:val=""/>
+      <w:lvlJc w:val="left"/>
+      <w:pPr>
+        <w:tabs>
+          <w:tab w:val="num" w:pos="720"/>
+        </w:tabs>
+        <w:ind w:left="720" w:hanging="360"/>
+      </w:pPr>
+      <w:rPr>
+        <w:rFonts w:ascii="Symbol" w:hAnsi="Symbol" w:hint="default"/>
+        <w:sz w:val="20"/>
+      </w:rPr>
+    </w:lvl>
+    <w:lvl w:ilvl="1" w:tentative="1">
+      <w:start w:val="1"/>
+      <w:numFmt w:val="bullet"/>
+      <w:lvlText w:val="o"/>
+      <w:lvlJc w:val="left"/>
+      <w:pPr>
+        <w:tabs>
+          <w:tab w:val="num" w:pos="1440"/>
+        </w:tabs>
+        <w:ind w:left="1440" w:hanging="360"/>
+      </w:pPr>
+      <w:rPr>
+        <w:rFonts w:ascii="Courier New" w:hAnsi="Courier New" w:hint="default"/>
+        <w:sz w:val="20"/>
+      </w:rPr>
+    </w:lvl>
+    <w:lvl w:ilvl="2" w:tentative="1">
+      <w:start w:val="1"/>
+      <w:numFmt w:val="bullet"/>
+      <w:lvlText w:val=""/>
+      <w:lvlJc w:val="left"/>
+      <w:pPr>
+        <w:tabs>
+          <w:tab w:val="num" w:pos="2160"/>
+        </w:tabs>
+        <w:ind w:left="2160" w:hanging="360"/>
+      </w:pPr>
+      <w:rPr>
+        <w:rFonts w:ascii="Wingdings" w:hAnsi="Wingdings" w:hint="default"/>
+        <w:sz w:val="20"/>
+      </w:rPr>
+    </w:lvl>
+    <w:lvl w:ilvl="3" w:tentative="1">
+      <w:start w:val="1"/>
+      <w:numFmt w:val="bullet"/>
+      <w:lvlText w:val=""/>
+      <w:lvlJc w:val="left"/>
+      <w:pPr>
+        <w:tabs>
+          <w:tab w:val="num" w:pos="2880"/>
+        </w:tabs>
+        <w:ind w:left="2880" w:hanging="360"/>
+      </w:pPr>
+      <w:rPr>
+        <w:rFonts w:ascii="Wingdings" w:hAnsi="Wingdings" w:hint="default"/>
+        <w:sz w:val="20"/>
+      </w:rPr>
+    </w:lvl>
+    <w:lvl w:ilvl="4" w:tentative="1">
+      <w:start w:val="1"/>
+      <w:numFmt w:val="bullet"/>
+      <w:lvlText w:val=""/>
+      <w:lvlJc w:val="left"/>
+      <w:pPr>
+        <w:tabs>
+          <w:tab w:val="num" w:pos="3600"/>
+        </w:tabs>
+        <w:ind w:left="3600" w:hanging="360"/>
+      </w:pPr>
+      <w:rPr>
+        <w:rFonts w:ascii="Wingdings" w:hAnsi="Wingdings" w:hint="default"/>
+        <w:sz w:val="20"/>
+      </w:rPr>
+    </w:lvl>
+    <w:lvl w:ilvl="5" w:tentative="1">
+      <w:start w:val="1"/>
+      <w:numFmt w:val="bullet"/>
+      <w:lvlText w:val=""/>
+      <w:lvlJc w:val="left"/>
+      <w:pPr>
+        <w:tabs>
+          <w:tab w:val="num" w:pos="4320"/>
+        </w:tabs>
+        <w:ind w:left="4320" w:hanging="360"/>
+      </w:pPr>
+      <w:rPr>
+        <w:rFonts w:ascii="Wingdings" w:hAnsi="Wingdings" w:hint="default"/>
+        <w:sz w:val="20"/>
+      </w:rPr>
+    </w:lvl>
+    <w:lvl w:ilvl="6" w:tentative="1">
+      <w:start w:val="1"/>
+      <w:numFmt w:val="bullet"/>
+      <w:lvlText w:val=""/>
+      <w:lvlJc w:val="left"/>
+      <w:pPr>
+        <w:tabs>
+          <w:tab w:val="num" w:pos="5040"/>
+        </w:tabs>
+        <w:ind w:left="5040" w:hanging="360"/>
+      </w:pPr>
+      <w:rPr>
+        <w:rFonts w:ascii="Wingdings" w:hAnsi="Wingdings" w:hint="default"/>
+        <w:sz w:val="20"/>
+      </w:rPr>
+    </w:lvl>
+    <w:lvl w:ilvl="7" w:tentative="1">
+      <w:start w:val="1"/>
+      <w:numFmt w:val="bullet"/>
+      <w:lvlText w:val=""/>
+      <w:lvlJc w:val="left"/>
+      <w:pPr>
+        <w:tabs>
+          <w:tab w:val="num" w:pos="5760"/>
+        </w:tabs>
+        <w:ind w:left="5760" w:hanging="360"/>
+      </w:pPr>
+      <w:rPr>
+        <w:rFonts w:ascii="Wingdings" w:hAnsi="Wingdings" w:hint="default"/>
+        <w:sz w:val="20"/>
+      </w:rPr>
+    </w:lvl>
+    <w:lvl w:ilvl="8" w:tentative="1">
+      <w:start w:val="1"/>
+      <w:numFmt w:val="bullet"/>
+      <w:lvlText w:val=""/>
+      <w:lvlJc w:val="left"/>
+      <w:pPr>
+        <w:tabs>
+          <w:tab w:val="num" w:pos="6480"/>
+        </w:tabs>
+        <w:ind w:left="6480" w:hanging="360"/>
+      </w:pPr>
+      <w:rPr>
+        <w:rFonts w:ascii="Wingdings" w:hAnsi="Wingdings" w:hint="default"/>
+        <w:sz w:val="20"/>
+      </w:rPr>
+    </w:lvl>
+  </w:abstractNum>
+  <w:abstractNum w:abstractNumId="8" w15:restartNumberingAfterBreak="0">
+    <w:nsid w:val="766B4768"/>
+    <w:multiLevelType w:val="multilevel"/>
+    <w:tmpl w:val="382095D6"/>
+    <w:lvl w:ilvl="0">
+      <w:start w:val="1"/>
+      <w:numFmt w:val="bullet"/>
+      <w:lvlText w:val=""/>
+      <w:lvlJc w:val="left"/>
+      <w:pPr>
+        <w:tabs>
+          <w:tab w:val="num" w:pos="720"/>
+        </w:tabs>
+        <w:ind w:left="720" w:hanging="360"/>
+      </w:pPr>
+      <w:rPr>
+        <w:rFonts w:ascii="Symbol" w:hAnsi="Symbol" w:hint="default"/>
+        <w:sz w:val="20"/>
+      </w:rPr>
+    </w:lvl>
+    <w:lvl w:ilvl="1" w:tentative="1">
+      <w:start w:val="1"/>
+      <w:numFmt w:val="bullet"/>
+      <w:lvlText w:val="o"/>
+      <w:lvlJc w:val="left"/>
+      <w:pPr>
+        <w:tabs>
+          <w:tab w:val="num" w:pos="1440"/>
+        </w:tabs>
+        <w:ind w:left="1440" w:hanging="360"/>
+      </w:pPr>
+      <w:rPr>
+        <w:rFonts w:ascii="Courier New" w:hAnsi="Courier New" w:hint="default"/>
+        <w:sz w:val="20"/>
+      </w:rPr>
+    </w:lvl>
+    <w:lvl w:ilvl="2" w:tentative="1">
+      <w:start w:val="1"/>
+      <w:numFmt w:val="bullet"/>
+      <w:lvlText w:val=""/>
+      <w:lvlJc w:val="left"/>
+      <w:pPr>
+        <w:tabs>
+          <w:tab w:val="num" w:pos="2160"/>
+        </w:tabs>
+        <w:ind w:left="2160" w:hanging="360"/>
+      </w:pPr>
+      <w:rPr>
+        <w:rFonts w:ascii="Wingdings" w:hAnsi="Wingdings" w:hint="default"/>
+        <w:sz w:val="20"/>
+      </w:rPr>
+    </w:lvl>
+    <w:lvl w:ilvl="3" w:tentative="1">
+      <w:start w:val="1"/>
+      <w:numFmt w:val="bullet"/>
+      <w:lvlText w:val=""/>
+      <w:lvlJc w:val="left"/>
+      <w:pPr>
+        <w:tabs>
+          <w:tab w:val="num" w:pos="2880"/>
+        </w:tabs>
+        <w:ind w:left="2880" w:hanging="360"/>
+      </w:pPr>
+      <w:rPr>
+        <w:rFonts w:ascii="Wingdings" w:hAnsi="Wingdings" w:hint="default"/>
+        <w:sz w:val="20"/>
+      </w:rPr>
+    </w:lvl>
+    <w:lvl w:ilvl="4" w:tentative="1">
+      <w:start w:val="1"/>
+      <w:numFmt w:val="bullet"/>
+      <w:lvlText w:val=""/>
+      <w:lvlJc w:val="left"/>
+      <w:pPr>
+        <w:tabs>
+          <w:tab w:val="num" w:pos="3600"/>
+        </w:tabs>
+        <w:ind w:left="3600" w:hanging="360"/>
+      </w:pPr>
+      <w:rPr>
+        <w:rFonts w:ascii="Wingdings" w:hAnsi="Wingdings" w:hint="default"/>
+        <w:sz w:val="20"/>
+      </w:rPr>
+    </w:lvl>
+    <w:lvl w:ilvl="5" w:tentative="1">
+      <w:start w:val="1"/>
+      <w:numFmt w:val="bullet"/>
+      <w:lvlText w:val=""/>
+      <w:lvlJc w:val="left"/>
+      <w:pPr>
+        <w:tabs>
+          <w:tab w:val="num" w:pos="4320"/>
+        </w:tabs>
+        <w:ind w:left="4320" w:hanging="360"/>
+      </w:pPr>
+      <w:rPr>
+        <w:rFonts w:ascii="Wingdings" w:hAnsi="Wingdings" w:hint="default"/>
+        <w:sz w:val="20"/>
+      </w:rPr>
+    </w:lvl>
+    <w:lvl w:ilvl="6" w:tentative="1">
+      <w:start w:val="1"/>
+      <w:numFmt w:val="bullet"/>
+      <w:lvlText w:val=""/>
+      <w:lvlJc w:val="left"/>
+      <w:pPr>
+        <w:tabs>
+          <w:tab w:val="num" w:pos="5040"/>
+        </w:tabs>
+        <w:ind w:left="5040" w:hanging="360"/>
+      </w:pPr>
+      <w:rPr>
+        <w:rFonts w:ascii="Wingdings" w:hAnsi="Wingdings" w:hint="default"/>
+        <w:sz w:val="20"/>
+      </w:rPr>
+    </w:lvl>
+    <w:lvl w:ilvl="7" w:tentative="1">
+      <w:start w:val="1"/>
+      <w:numFmt w:val="bullet"/>
+      <w:lvlText w:val=""/>
+      <w:lvlJc w:val="left"/>
+      <w:pPr>
+        <w:tabs>
+          <w:tab w:val="num" w:pos="5760"/>
+        </w:tabs>
+        <w:ind w:left="5760" w:hanging="360"/>
+      </w:pPr>
+      <w:rPr>
+        <w:rFonts w:ascii="Wingdings" w:hAnsi="Wingdings" w:hint="default"/>
+        <w:sz w:val="20"/>
+      </w:rPr>
+    </w:lvl>
+    <w:lvl w:ilvl="8" w:tentative="1">
+      <w:start w:val="1"/>
+      <w:numFmt w:val="bullet"/>
+      <w:lvlText w:val=""/>
+      <w:lvlJc w:val="left"/>
+      <w:pPr>
+        <w:tabs>
+          <w:tab w:val="num" w:pos="6480"/>
+        </w:tabs>
+        <w:ind w:left="6480" w:hanging="360"/>
+      </w:pPr>
+      <w:rPr>
+        <w:rFonts w:ascii="Wingdings" w:hAnsi="Wingdings" w:hint="default"/>
+        <w:sz w:val="20"/>
+      </w:rPr>
+    </w:lvl>
+  </w:abstractNum>
+  <w:abstractNum w:abstractNumId="9" w15:restartNumberingAfterBreak="0">
+    <w:nsid w:val="791E34BA"/>
+    <w:multiLevelType w:val="multilevel"/>
+    <w:tmpl w:val="DE54CA48"/>
+    <w:lvl w:ilvl="0">
+      <w:start w:val="1"/>
+      <w:numFmt w:val="bullet"/>
+      <w:lvlText w:val=""/>
+      <w:lvlJc w:val="left"/>
+      <w:pPr>
+        <w:tabs>
+          <w:tab w:val="num" w:pos="720"/>
+        </w:tabs>
+        <w:ind w:left="720" w:hanging="360"/>
+      </w:pPr>
+      <w:rPr>
+        <w:rFonts w:ascii="Symbol" w:hAnsi="Symbol" w:hint="default"/>
+        <w:sz w:val="20"/>
+      </w:rPr>
+    </w:lvl>
+    <w:lvl w:ilvl="1" w:tentative="1">
+      <w:start w:val="1"/>
+      <w:numFmt w:val="bullet"/>
+      <w:lvlText w:val="o"/>
+      <w:lvlJc w:val="left"/>
+      <w:pPr>
+        <w:tabs>
+          <w:tab w:val="num" w:pos="1440"/>
+        </w:tabs>
+        <w:ind w:left="1440" w:hanging="360"/>
+      </w:pPr>
+      <w:rPr>
+        <w:rFonts w:ascii="Courier New" w:hAnsi="Courier New" w:hint="default"/>
+        <w:sz w:val="20"/>
+      </w:rPr>
+    </w:lvl>
+    <w:lvl w:ilvl="2" w:tentative="1">
+      <w:start w:val="1"/>
+      <w:numFmt w:val="bullet"/>
+      <w:lvlText w:val=""/>
+      <w:lvlJc w:val="left"/>
+      <w:pPr>
+        <w:tabs>
+          <w:tab w:val="num" w:pos="2160"/>
+        </w:tabs>
+        <w:ind w:left="2160" w:hanging="360"/>
+      </w:pPr>
+      <w:rPr>
+        <w:rFonts w:ascii="Wingdings" w:hAnsi="Wingdings" w:hint="default"/>
+        <w:sz w:val="20"/>
+      </w:rPr>
+    </w:lvl>
+    <w:lvl w:ilvl="3" w:tentative="1">
+      <w:start w:val="1"/>
+      <w:numFmt w:val="bullet"/>
+      <w:lvlText w:val=""/>
+      <w:lvlJc w:val="left"/>
+      <w:pPr>
+        <w:tabs>
+          <w:tab w:val="num" w:pos="2880"/>
+        </w:tabs>
+        <w:ind w:left="2880" w:hanging="360"/>
+      </w:pPr>
+      <w:rPr>
+        <w:rFonts w:ascii="Wingdings" w:hAnsi="Wingdings" w:hint="default"/>
+        <w:sz w:val="20"/>
+      </w:rPr>
+    </w:lvl>
+    <w:lvl w:ilvl="4" w:tentative="1">
+      <w:start w:val="1"/>
+      <w:numFmt w:val="bullet"/>
+      <w:lvlText w:val=""/>
+      <w:lvlJc w:val="left"/>
+      <w:pPr>
+        <w:tabs>
+          <w:tab w:val="num" w:pos="3600"/>
+        </w:tabs>
+        <w:ind w:left="3600" w:hanging="360"/>
+      </w:pPr>
+      <w:rPr>
+        <w:rFonts w:ascii="Wingdings" w:hAnsi="Wingdings" w:hint="default"/>
+        <w:sz w:val="20"/>
+      </w:rPr>
+    </w:lvl>
+    <w:lvl w:ilvl="5" w:tentative="1">
+      <w:start w:val="1"/>
+      <w:numFmt w:val="bullet"/>
+      <w:lvlText w:val=""/>
+      <w:lvlJc w:val="left"/>
+      <w:pPr>
+        <w:tabs>
+          <w:tab w:val="num" w:pos="4320"/>
+        </w:tabs>
+        <w:ind w:left="4320" w:hanging="360"/>
+      </w:pPr>
+      <w:rPr>
+        <w:rFonts w:ascii="Wingdings" w:hAnsi="Wingdings" w:hint="default"/>
+        <w:sz w:val="20"/>
+      </w:rPr>
+    </w:lvl>
+    <w:lvl w:ilvl="6" w:tentative="1">
+      <w:start w:val="1"/>
+      <w:numFmt w:val="bullet"/>
+      <w:lvlText w:val=""/>
+      <w:lvlJc w:val="left"/>
+      <w:pPr>
+        <w:tabs>
+          <w:tab w:val="num" w:pos="5040"/>
+        </w:tabs>
+        <w:ind w:left="5040" w:hanging="360"/>
+      </w:pPr>
+      <w:rPr>
+        <w:rFonts w:ascii="Wingdings" w:hAnsi="Wingdings" w:hint="default"/>
+        <w:sz w:val="20"/>
+      </w:rPr>
+    </w:lvl>
+    <w:lvl w:ilvl="7" w:tentative="1">
+      <w:start w:val="1"/>
+      <w:numFmt w:val="bullet"/>
+      <w:lvlText w:val=""/>
+      <w:lvlJc w:val="left"/>
+      <w:pPr>
+        <w:tabs>
+          <w:tab w:val="num" w:pos="5760"/>
+        </w:tabs>
+        <w:ind w:left="5760" w:hanging="360"/>
+      </w:pPr>
+      <w:rPr>
+        <w:rFonts w:ascii="Wingdings" w:hAnsi="Wingdings" w:hint="default"/>
+        <w:sz w:val="20"/>
+      </w:rPr>
+    </w:lvl>
+    <w:lvl w:ilvl="8" w:tentative="1">
+      <w:start w:val="1"/>
+      <w:numFmt w:val="bullet"/>
+      <w:lvlText w:val=""/>
+      <w:lvlJc w:val="left"/>
+      <w:pPr>
+        <w:tabs>
+          <w:tab w:val="num" w:pos="6480"/>
+        </w:tabs>
+        <w:ind w:left="6480" w:hanging="360"/>
+      </w:pPr>
+      <w:rPr>
+        <w:rFonts w:ascii="Wingdings" w:hAnsi="Wingdings" w:hint="default"/>
+        <w:sz w:val="20"/>
+      </w:rPr>
+    </w:lvl>
+  </w:abstractNum>
+  <w:abstractNum w:abstractNumId="10" w15:restartNumberingAfterBreak="0">
+    <w:nsid w:val="7B42619B"/>
+    <w:multiLevelType w:val="multilevel"/>
+    <w:tmpl w:val="6F3EFB7E"/>
+    <w:lvl w:ilvl="0">
+      <w:start w:val="1"/>
+      <w:numFmt w:val="bullet"/>
+      <w:lvlText w:val=""/>
+      <w:lvlJc w:val="left"/>
+      <w:pPr>
+        <w:tabs>
+          <w:tab w:val="num" w:pos="720"/>
+        </w:tabs>
+        <w:ind w:left="720" w:hanging="360"/>
+      </w:pPr>
+      <w:rPr>
+        <w:rFonts w:ascii="Symbol" w:hAnsi="Symbol" w:hint="default"/>
+        <w:sz w:val="20"/>
+      </w:rPr>
+    </w:lvl>
+    <w:lvl w:ilvl="1" w:tentative="1">
+      <w:start w:val="1"/>
+      <w:numFmt w:val="bullet"/>
+      <w:lvlText w:val="o"/>
+      <w:lvlJc w:val="left"/>
+      <w:pPr>
+        <w:tabs>
+          <w:tab w:val="num" w:pos="1440"/>
+        </w:tabs>
+        <w:ind w:left="1440" w:hanging="360"/>
+      </w:pPr>
+      <w:rPr>
+        <w:rFonts w:ascii="Courier New" w:hAnsi="Courier New" w:hint="default"/>
+        <w:sz w:val="20"/>
+      </w:rPr>
+    </w:lvl>
+    <w:lvl w:ilvl="2" w:tentative="1">
+      <w:start w:val="1"/>
+      <w:numFmt w:val="bullet"/>
+      <w:lvlText w:val=""/>
+      <w:lvlJc w:val="left"/>
+      <w:pPr>
+        <w:tabs>
+          <w:tab w:val="num" w:pos="2160"/>
+        </w:tabs>
+        <w:ind w:left="2160" w:hanging="360"/>
+      </w:pPr>
+      <w:rPr>
+        <w:rFonts w:ascii="Wingdings" w:hAnsi="Wingdings" w:hint="default"/>
+        <w:sz w:val="20"/>
+      </w:rPr>
+    </w:lvl>
+    <w:lvl w:ilvl="3" w:tentative="1">
+      <w:start w:val="1"/>
+      <w:numFmt w:val="bullet"/>
+      <w:lvlText w:val=""/>
+      <w:lvlJc w:val="left"/>
+      <w:pPr>
+        <w:tabs>
+          <w:tab w:val="num" w:pos="2880"/>
+        </w:tabs>
+        <w:ind w:left="2880" w:hanging="360"/>
+      </w:pPr>
+      <w:rPr>
+        <w:rFonts w:ascii="Wingdings" w:hAnsi="Wingdings" w:hint="default"/>
+        <w:sz w:val="20"/>
+      </w:rPr>
+    </w:lvl>
+    <w:lvl w:ilvl="4" w:tentative="1">
+      <w:start w:val="1"/>
+      <w:numFmt w:val="bullet"/>
+      <w:lvlText w:val=""/>
+      <w:lvlJc w:val="left"/>
+      <w:pPr>
+        <w:tabs>
+          <w:tab w:val="num" w:pos="3600"/>
+        </w:tabs>
+        <w:ind w:left="3600" w:hanging="360"/>
+      </w:pPr>
+      <w:rPr>
+        <w:rFonts w:ascii="Wingdings" w:hAnsi="Wingdings" w:hint="default"/>
+        <w:sz w:val="20"/>
+      </w:rPr>
+    </w:lvl>
+    <w:lvl w:ilvl="5" w:tentative="1">
+      <w:start w:val="1"/>
+      <w:numFmt w:val="bullet"/>
+      <w:lvlText w:val=""/>
+      <w:lvlJc w:val="left"/>
+      <w:pPr>
+        <w:tabs>
+          <w:tab w:val="num" w:pos="4320"/>
+        </w:tabs>
+        <w:ind w:left="4320" w:hanging="360"/>
+      </w:pPr>
+      <w:rPr>
+        <w:rFonts w:ascii="Wingdings" w:hAnsi="Wingdings" w:hint="default"/>
+        <w:sz w:val="20"/>
+      </w:rPr>
+    </w:lvl>
+    <w:lvl w:ilvl="6" w:tentative="1">
+      <w:start w:val="1"/>
+      <w:numFmt w:val="bullet"/>
+      <w:lvlText w:val=""/>
+      <w:lvlJc w:val="left"/>
+      <w:pPr>
+        <w:tabs>
+          <w:tab w:val="num" w:pos="5040"/>
+        </w:tabs>
+        <w:ind w:left="5040" w:hanging="360"/>
+      </w:pPr>
+      <w:rPr>
+        <w:rFonts w:ascii="Wingdings" w:hAnsi="Wingdings" w:hint="default"/>
+        <w:sz w:val="20"/>
+      </w:rPr>
+    </w:lvl>
+    <w:lvl w:ilvl="7" w:tentative="1">
+      <w:start w:val="1"/>
+      <w:numFmt w:val="bullet"/>
+      <w:lvlText w:val=""/>
+      <w:lvlJc w:val="left"/>
+      <w:pPr>
+        <w:tabs>
+          <w:tab w:val="num" w:pos="5760"/>
+        </w:tabs>
+        <w:ind w:left="5760" w:hanging="360"/>
+      </w:pPr>
+      <w:rPr>
+        <w:rFonts w:ascii="Wingdings" w:hAnsi="Wingdings" w:hint="default"/>
+        <w:sz w:val="20"/>
+      </w:rPr>
+    </w:lvl>
+    <w:lvl w:ilvl="8" w:tentative="1">
+      <w:start w:val="1"/>
+      <w:numFmt w:val="bullet"/>
+      <w:lvlText w:val=""/>
+      <w:lvlJc w:val="left"/>
+      <w:pPr>
+        <w:tabs>
+          <w:tab w:val="num" w:pos="6480"/>
+        </w:tabs>
+        <w:ind w:left="6480" w:hanging="360"/>
+      </w:pPr>
+      <w:rPr>
+        <w:rFonts w:ascii="Wingdings" w:hAnsi="Wingdings" w:hint="default"/>
+        <w:sz w:val="20"/>
+      </w:rPr>
+    </w:lvl>
+  </w:abstractNum>
+  <w:abstractNum w:abstractNumId="11" w15:restartNumberingAfterBreak="0">
+    <w:nsid w:val="7E65401C"/>
+    <w:multiLevelType w:val="multilevel"/>
+    <w:tmpl w:val="54DE565A"/>
+    <w:lvl w:ilvl="0">
+      <w:start w:val="1"/>
+      <w:numFmt w:val="bullet"/>
+      <w:lvlText w:val=""/>
+      <w:lvlJc w:val="left"/>
+      <w:pPr>
+        <w:tabs>
+          <w:tab w:val="num" w:pos="720"/>
+        </w:tabs>
+        <w:ind w:left="720" w:hanging="360"/>
+      </w:pPr>
+      <w:rPr>
+        <w:rFonts w:ascii="Symbol" w:hAnsi="Symbol" w:hint="default"/>
+        <w:sz w:val="20"/>
+      </w:rPr>
+    </w:lvl>
+    <w:lvl w:ilvl="1" w:tentative="1">
+      <w:start w:val="1"/>
+      <w:numFmt w:val="bullet"/>
+      <w:lvlText w:val="o"/>
+      <w:lvlJc w:val="left"/>
+      <w:pPr>
+        <w:tabs>
+          <w:tab w:val="num" w:pos="1440"/>
+        </w:tabs>
+        <w:ind w:left="1440" w:hanging="360"/>
+      </w:pPr>
+      <w:rPr>
+        <w:rFonts w:ascii="Courier New" w:hAnsi="Courier New" w:hint="default"/>
+        <w:sz w:val="20"/>
+      </w:rPr>
+    </w:lvl>
+    <w:lvl w:ilvl="2" w:tentative="1">
+      <w:start w:val="1"/>
+      <w:numFmt w:val="bullet"/>
+      <w:lvlText w:val=""/>
+      <w:lvlJc w:val="left"/>
+      <w:pPr>
+        <w:tabs>
+          <w:tab w:val="num" w:pos="2160"/>
+        </w:tabs>
+        <w:ind w:left="2160" w:hanging="360"/>
+      </w:pPr>
+      <w:rPr>
+        <w:rFonts w:ascii="Wingdings" w:hAnsi="Wingdings" w:hint="default"/>
+        <w:sz w:val="20"/>
+      </w:rPr>
+    </w:lvl>
+    <w:lvl w:ilvl="3" w:tentative="1">
+      <w:start w:val="1"/>
+      <w:numFmt w:val="bullet"/>
+      <w:lvlText w:val=""/>
+      <w:lvlJc w:val="left"/>
+      <w:pPr>
+        <w:tabs>
+          <w:tab w:val="num" w:pos="2880"/>
+        </w:tabs>
+        <w:ind w:left="2880" w:hanging="360"/>
+      </w:pPr>
+      <w:rPr>
+        <w:rFonts w:ascii="Wingdings" w:hAnsi="Wingdings" w:hint="default"/>
+        <w:sz w:val="20"/>
+      </w:rPr>
+    </w:lvl>
+    <w:lvl w:ilvl="4" w:tentative="1">
+      <w:start w:val="1"/>
+      <w:numFmt w:val="bullet"/>
+      <w:lvlText w:val=""/>
+      <w:lvlJc w:val="left"/>
+      <w:pPr>
+        <w:tabs>
+          <w:tab w:val="num" w:pos="3600"/>
+        </w:tabs>
+        <w:ind w:left="3600" w:hanging="360"/>
+      </w:pPr>
+      <w:rPr>
+        <w:rFonts w:ascii="Wingdings" w:hAnsi="Wingdings" w:hint="default"/>
+        <w:sz w:val="20"/>
+      </w:rPr>
+    </w:lvl>
+    <w:lvl w:ilvl="5" w:tentative="1">
+      <w:start w:val="1"/>
+      <w:numFmt w:val="bullet"/>
+      <w:lvlText w:val=""/>
+      <w:lvlJc w:val="left"/>
+      <w:pPr>
+        <w:tabs>
+          <w:tab w:val="num" w:pos="4320"/>
+        </w:tabs>
+        <w:ind w:left="4320" w:hanging="360"/>
+      </w:pPr>
+      <w:rPr>
+        <w:rFonts w:ascii="Wingdings" w:hAnsi="Wingdings" w:hint="default"/>
+        <w:sz w:val="20"/>
+      </w:rPr>
+    </w:lvl>
+    <w:lvl w:ilvl="6" w:tentative="1">
+      <w:start w:val="1"/>
+      <w:numFmt w:val="bullet"/>
+      <w:lvlText w:val=""/>
+      <w:lvlJc w:val="left"/>
+      <w:pPr>
+        <w:tabs>
+          <w:tab w:val="num" w:pos="5040"/>
+        </w:tabs>
+        <w:ind w:left="5040" w:hanging="360"/>
+      </w:pPr>
+      <w:rPr>
+        <w:rFonts w:ascii="Wingdings" w:hAnsi="Wingdings" w:hint="default"/>
+        <w:sz w:val="20"/>
+      </w:rPr>
+    </w:lvl>
+    <w:lvl w:ilvl="7" w:tentative="1">
+      <w:start w:val="1"/>
+      <w:numFmt w:val="bullet"/>
+      <w:lvlText w:val=""/>
+      <w:lvlJc w:val="left"/>
+      <w:pPr>
+        <w:tabs>
+          <w:tab w:val="num" w:pos="5760"/>
+        </w:tabs>
+        <w:ind w:left="5760" w:hanging="360"/>
+      </w:pPr>
+      <w:rPr>
+        <w:rFonts w:ascii="Wingdings" w:hAnsi="Wingdings" w:hint="default"/>
+        <w:sz w:val="20"/>
+      </w:rPr>
+    </w:lvl>
+    <w:lvl w:ilvl="8" w:tentative="1">
+      <w:start w:val="1"/>
+      <w:numFmt w:val="bullet"/>
+      <w:lvlText w:val=""/>
+      <w:lvlJc w:val="left"/>
+      <w:pPr>
+        <w:tabs>
+          <w:tab w:val="num" w:pos="6480"/>
+        </w:tabs>
+        <w:ind w:left="6480" w:hanging="360"/>
+      </w:pPr>
+      <w:rPr>
+        <w:rFonts w:ascii="Wingdings" w:hAnsi="Wingdings" w:hint="default"/>
+        <w:sz w:val="20"/>
+      </w:rPr>
+    </w:lvl>
+  </w:abstractNum>
   <w:num w:numId="1" w16cid:durableId="849374512">
+    <w:abstractNumId w:val="5"/>
+  </w:num>
+  <w:num w:numId="2" w16cid:durableId="1283459249">
     <w:abstractNumId w:val="1"/>
   </w:num>
-  <w:num w:numId="2" w16cid:durableId="1283459249">
+  <w:num w:numId="3" w16cid:durableId="2115594626">
+    <w:abstractNumId w:val="6"/>
+  </w:num>
+  <w:num w:numId="4" w16cid:durableId="1822042886">
+    <w:abstractNumId w:val="9"/>
+  </w:num>
+  <w:num w:numId="5" w16cid:durableId="851843873">
+    <w:abstractNumId w:val="4"/>
+  </w:num>
+  <w:num w:numId="6" w16cid:durableId="1891915994">
+    <w:abstractNumId w:val="8"/>
+  </w:num>
+  <w:num w:numId="7" w16cid:durableId="1847211214">
+    <w:abstractNumId w:val="10"/>
+  </w:num>
+  <w:num w:numId="8" w16cid:durableId="95373212">
+    <w:abstractNumId w:val="2"/>
+  </w:num>
+  <w:num w:numId="9" w16cid:durableId="611984440">
+    <w:abstractNumId w:val="11"/>
+  </w:num>
+  <w:num w:numId="10" w16cid:durableId="1881161334">
+    <w:abstractNumId w:val="3"/>
+  </w:num>
+  <w:num w:numId="11" w16cid:durableId="371685523">
     <w:abstractNumId w:val="0"/>
+  </w:num>
+  <w:num w:numId="12" w16cid:durableId="1879010123">
+    <w:abstractNumId w:val="7"/>
   </w:num>
 </w:numbering>
 </file>

</xml_diff>